<commit_message>
chore: prune incomplete runs, rebuild artifacts, stop in-flight batches
Removes eight run directories that were killed mid-flight and carry no
audit_score.json. A directory with a sealed audit but no score is a run that
never finished; leaving them risked the dashboard or walkthrough treating a
partial run as data.

Completed runs from earlier code hashes are KEPT. The directory names embed
the code version, so provenance stays visible, and both builders select the
newest artifact per (family, seed) rather than mixing versions silently.
Deleting them would have discarded F5's twenty seeds and most of F6 for no
integrity gain.

Registered F8/F10 batch stopped partway: F8 now has ten completed seeds
against the contract's twenty, F10 still two. Both remain below the
registered protocol and are marked as such in the artifacts.

Dashboard and walkthrough rebuilt from the pruned artifact set. 75 tests
pass.
</commit_message>
<xml_diff>
--- a/docs/Walkthrough.docx
+++ b/docs/Walkthrough.docx
@@ -877,7 +877,7 @@
           </w:tcPr>
           <w:p>
             <w:r>
-              <w:t>1</w:t>
+              <w:t>9</w:t>
             </w:r>
           </w:p>
         </w:tc>
@@ -887,7 +887,7 @@
           </w:tcPr>
           <w:p>
             <w:r>
-              <w:t>0.307</w:t>
+              <w:t>0.401  [0.376 – 0.415]</w:t>
             </w:r>
           </w:p>
         </w:tc>
@@ -897,7 +897,7 @@
           </w:tcPr>
           <w:p>
             <w:r>
-              <w:t>0.429</w:t>
+              <w:t>0.417  [0.391 – 0.440]</w:t>
             </w:r>
           </w:p>
         </w:tc>
@@ -907,7 +907,7 @@
           </w:tcPr>
           <w:p>
             <w:r>
-              <w:t>0.006</w:t>
+              <w:t>0.003  [0.002 – 0.003]</w:t>
             </w:r>
           </w:p>
         </w:tc>
@@ -917,7 +917,7 @@
           </w:tcPr>
           <w:p>
             <w:r>
-              <w:t>0.806</w:t>
+              <w:t>0.919  [0.850 – 0.944]</w:t>
             </w:r>
           </w:p>
         </w:tc>
@@ -927,7 +927,7 @@
           </w:tcPr>
           <w:p>
             <w:r>
-              <w:t>0.004</w:t>
+              <w:t>0.004  [0.004 – 0.004]</w:t>
             </w:r>
           </w:p>
         </w:tc>
@@ -1197,7 +1197,7 @@
           </w:tcPr>
           <w:p>
             <w:r>
-              <w:t>1</w:t>
+              <w:t>9</w:t>
             </w:r>
           </w:p>
         </w:tc>
@@ -1207,7 +1207,7 @@
           </w:tcPr>
           <w:p>
             <w:r>
-              <w:t>-0.035</w:t>
+              <w:t>0.100  [0.044 – 0.126]</w:t>
             </w:r>
           </w:p>
         </w:tc>
@@ -1217,7 +1217,7 @@
           </w:tcPr>
           <w:p>
             <w:r>
-              <w:t>0.000</w:t>
+              <w:t>0.000  [0.000 – 0.000]</w:t>
             </w:r>
           </w:p>
         </w:tc>
@@ -1677,7 +1677,7 @@
     </w:p>
     <w:p>
       <w:r>
-        <w:t>Run artifacts aggregated in this document: 34 run directories under runs/.</w:t>
+        <w:t>Run artifacts aggregated in this document: 42 run directories under runs/.</w:t>
       </w:r>
     </w:p>
     <w:sectPr>

</xml_diff>

<commit_message>
run: registered protocol complete - 100/100 seeded runs, F-009 fix, F-010 results
All five families finished 20 seeds x 10 generations. F8 re-ran post-F-008,
F10 re-ran post-F-009 (shared genuine agent pool with adoption churn, 78
tests). LOFO re-run on the final tree: enumeration caught 98.3% zero-shot
from bust-out's side, bust-out 5.5% from enumeration's; the logistic baseline
beating the boosted model on F6 is recorded as a finding, not hidden.

F-010 in FINDINGS carries the registered outcome: F8 the hard family (AUPRC
0.376, VWR 0.903, +0.067 retrain delta), F10 loud post-fix (AUPRC 0.985),
evasion zero everywhere with attacker yield near zero - containment, not a
manufactured co-evolution curve. Dashboard and walkthrough rebuilt from the
final artifacts.
</commit_message>
<xml_diff>
--- a/docs/Walkthrough.docx
+++ b/docs/Walkthrough.docx
@@ -589,7 +589,7 @@
           </w:tcPr>
           <w:p>
             <w:r>
-              <w:t>1</w:t>
+              <w:t>20</w:t>
             </w:r>
           </w:p>
         </w:tc>
@@ -599,7 +599,7 @@
           </w:tcPr>
           <w:p>
             <w:r>
-              <w:t>0.965</w:t>
+              <w:t>0.985  [0.967 – 0.998]</w:t>
             </w:r>
           </w:p>
         </w:tc>
@@ -609,7 +609,7 @@
           </w:tcPr>
           <w:p>
             <w:r>
-              <w:t>0.944</w:t>
+              <w:t>0.961  [0.702 – 0.991]</w:t>
             </w:r>
           </w:p>
         </w:tc>
@@ -619,7 +619,7 @@
           </w:tcPr>
           <w:p>
             <w:r>
-              <w:t>0.001</w:t>
+              <w:t>0.000  [0.000 – 0.000]</w:t>
             </w:r>
           </w:p>
         </w:tc>
@@ -629,7 +629,7 @@
           </w:tcPr>
           <w:p>
             <w:r>
-              <w:t>0.978</w:t>
+              <w:t>0.965  [0.807 – 0.997]</w:t>
             </w:r>
           </w:p>
         </w:tc>
@@ -639,7 +639,7 @@
           </w:tcPr>
           <w:p>
             <w:r>
-              <w:t>0.007</w:t>
+              <w:t>0.004  [0.004 – 0.004]</w:t>
             </w:r>
           </w:p>
         </w:tc>
@@ -661,7 +661,7 @@
           </w:tcPr>
           <w:p>
             <w:r>
-              <w:t>3</w:t>
+              <w:t>20</w:t>
             </w:r>
           </w:p>
         </w:tc>
@@ -671,7 +671,7 @@
           </w:tcPr>
           <w:p>
             <w:r>
-              <w:t>0.947  [0.945 – 0.962]</w:t>
+              <w:t>0.948  [0.922 – 0.955]</w:t>
             </w:r>
           </w:p>
         </w:tc>
@@ -681,7 +681,7 @@
           </w:tcPr>
           <w:p>
             <w:r>
-              <w:t>0.938  [0.935 – 0.956]</w:t>
+              <w:t>0.940  [0.926 – 0.948]</w:t>
             </w:r>
           </w:p>
         </w:tc>
@@ -691,7 +691,7 @@
           </w:tcPr>
           <w:p>
             <w:r>
-              <w:t>0.001  [0.001 – 0.002]</w:t>
+              <w:t>0.001  [0.000 – 0.002]</w:t>
             </w:r>
           </w:p>
         </w:tc>
@@ -701,7 +701,7 @@
           </w:tcPr>
           <w:p>
             <w:r>
-              <w:t>0.939  [0.923 – 0.950]</w:t>
+              <w:t>0.929  [0.915 – 0.941]</w:t>
             </w:r>
           </w:p>
         </w:tc>
@@ -743,7 +743,7 @@
           </w:tcPr>
           <w:p>
             <w:r>
-              <w:t>0.867  [0.824 – 0.904]</w:t>
+              <w:t>0.878  [0.849 – 0.937]</w:t>
             </w:r>
           </w:p>
         </w:tc>
@@ -753,7 +753,7 @@
           </w:tcPr>
           <w:p>
             <w:r>
-              <w:t>0.559  [0.170 – 0.667]</w:t>
+              <w:t>0.620  [0.189 – 0.761]</w:t>
             </w:r>
           </w:p>
         </w:tc>
@@ -773,7 +773,7 @@
           </w:tcPr>
           <w:p>
             <w:r>
-              <w:t>0.363  [0.066 – 0.846]</w:t>
+              <w:t>0.359  [0.066 – 0.880]</w:t>
             </w:r>
           </w:p>
         </w:tc>
@@ -805,7 +805,7 @@
           </w:tcPr>
           <w:p>
             <w:r>
-              <w:t>9</w:t>
+              <w:t>20</w:t>
             </w:r>
           </w:p>
         </w:tc>
@@ -815,7 +815,7 @@
           </w:tcPr>
           <w:p>
             <w:r>
-              <w:t>0.987  [0.976 – 0.996]</w:t>
+              <w:t>0.977  [0.849 – 0.998]</w:t>
             </w:r>
           </w:p>
         </w:tc>
@@ -825,7 +825,7 @@
           </w:tcPr>
           <w:p>
             <w:r>
-              <w:t>0.677  [0.489 – 0.914]</w:t>
+              <w:t>0.496  [0.269 – 0.731]</w:t>
             </w:r>
           </w:p>
         </w:tc>
@@ -845,7 +845,7 @@
           </w:tcPr>
           <w:p>
             <w:r>
-              <w:t>0.708  [0.383 – 0.987]</w:t>
+              <w:t>0.581  [0.371 – 0.867]</w:t>
             </w:r>
           </w:p>
         </w:tc>
@@ -877,7 +877,7 @@
           </w:tcPr>
           <w:p>
             <w:r>
-              <w:t>9</w:t>
+              <w:t>20</w:t>
             </w:r>
           </w:p>
         </w:tc>
@@ -887,7 +887,7 @@
           </w:tcPr>
           <w:p>
             <w:r>
-              <w:t>0.401  [0.376 – 0.415]</w:t>
+              <w:t>0.376  [0.302 – 0.457]</w:t>
             </w:r>
           </w:p>
         </w:tc>
@@ -897,7 +897,7 @@
           </w:tcPr>
           <w:p>
             <w:r>
-              <w:t>0.417  [0.391 – 0.440]</w:t>
+              <w:t>0.404  [0.335 – 0.472]</w:t>
             </w:r>
           </w:p>
         </w:tc>
@@ -907,7 +907,7 @@
           </w:tcPr>
           <w:p>
             <w:r>
-              <w:t>0.003  [0.002 – 0.003]</w:t>
+              <w:t>0.003  [0.002 – 0.004]</w:t>
             </w:r>
           </w:p>
         </w:tc>
@@ -917,7 +917,7 @@
           </w:tcPr>
           <w:p>
             <w:r>
-              <w:t>0.919  [0.850 – 0.944]</w:t>
+              <w:t>0.903  [0.828 – 0.942]</w:t>
             </w:r>
           </w:p>
         </w:tc>
@@ -1029,7 +1029,7 @@
           </w:tcPr>
           <w:p>
             <w:r>
-              <w:t>1</w:t>
+              <w:t>20</w:t>
             </w:r>
           </w:p>
         </w:tc>
@@ -1039,7 +1039,7 @@
           </w:tcPr>
           <w:p>
             <w:r>
-              <w:t>-0.012</w:t>
+              <w:t>0.000  [0.000 – 0.009]</w:t>
             </w:r>
           </w:p>
         </w:tc>
@@ -1049,7 +1049,7 @@
           </w:tcPr>
           <w:p>
             <w:r>
-              <w:t>20684.328</w:t>
+              <w:t>0.000  [0.000 – 0.000]</w:t>
             </w:r>
           </w:p>
         </w:tc>
@@ -1071,7 +1071,7 @@
           </w:tcPr>
           <w:p>
             <w:r>
-              <w:t>3</w:t>
+              <w:t>20</w:t>
             </w:r>
           </w:p>
         </w:tc>
@@ -1081,7 +1081,7 @@
           </w:tcPr>
           <w:p>
             <w:r>
-              <w:t>0.006  [0.003 – 0.032]</w:t>
+              <w:t>0.000  [0.000 – 0.005]</w:t>
             </w:r>
           </w:p>
         </w:tc>
@@ -1091,7 +1091,7 @@
           </w:tcPr>
           <w:p>
             <w:r>
-              <w:t>88.889  [44.444 – 155.556]</w:t>
+              <w:t>0.000  [0.000 – 0.000]</w:t>
             </w:r>
           </w:p>
         </w:tc>
@@ -1123,7 +1123,7 @@
           </w:tcPr>
           <w:p>
             <w:r>
-              <w:t>0.008  [0.000 – 0.051]</w:t>
+              <w:t>0.007  [0.000 – 0.023]</w:t>
             </w:r>
           </w:p>
         </w:tc>
@@ -1133,7 +1133,7 @@
           </w:tcPr>
           <w:p>
             <w:r>
-              <w:t>49.161  [3.484 – 352.649]</w:t>
+              <w:t>60.650  [3.484 – 263.348]</w:t>
             </w:r>
           </w:p>
         </w:tc>
@@ -1155,7 +1155,7 @@
           </w:tcPr>
           <w:p>
             <w:r>
-              <w:t>9</w:t>
+              <w:t>20</w:t>
             </w:r>
           </w:p>
         </w:tc>
@@ -1165,7 +1165,7 @@
           </w:tcPr>
           <w:p>
             <w:r>
-              <w:t>0.018  [0.007 – 0.067]</w:t>
+              <w:t>0.015  [-0.001 – 0.058]</w:t>
             </w:r>
           </w:p>
         </w:tc>
@@ -1175,7 +1175,7 @@
           </w:tcPr>
           <w:p>
             <w:r>
-              <w:t>0.000  [0.000 – 0.000]</w:t>
+              <w:t>0.000  [0.000 – 141.096]</w:t>
             </w:r>
           </w:p>
         </w:tc>
@@ -1197,7 +1197,7 @@
           </w:tcPr>
           <w:p>
             <w:r>
-              <w:t>9</w:t>
+              <w:t>20</w:t>
             </w:r>
           </w:p>
         </w:tc>
@@ -1207,7 +1207,7 @@
           </w:tcPr>
           <w:p>
             <w:r>
-              <w:t>0.100  [0.044 – 0.126]</w:t>
+              <w:t>0.067  [0.029 – 0.093]</w:t>
             </w:r>
           </w:p>
         </w:tc>
@@ -1217,7 +1217,7 @@
           </w:tcPr>
           <w:p>
             <w:r>
-              <w:t>0.000  [0.000 – 0.000]</w:t>
+              <w:t>0.000  [0.000 – 31.304]</w:t>
             </w:r>
           </w:p>
         </w:tc>
@@ -1387,7 +1387,7 @@
           </w:tcPr>
           <w:p>
             <w:r>
-              <w:t>0.553</w:t>
+              <w:t>0.531</w:t>
             </w:r>
           </w:p>
         </w:tc>
@@ -1397,7 +1397,7 @@
           </w:tcPr>
           <w:p>
             <w:r>
-              <w:t>0.975 (FPR 0.4936%)</w:t>
+              <w:t>0.983 (FPR 0.4802%)</w:t>
             </w:r>
           </w:p>
         </w:tc>
@@ -1407,7 +1407,7 @@
           </w:tcPr>
           <w:p>
             <w:r>
-              <w:t>0.002</w:t>
+              <w:t>0.246</w:t>
             </w:r>
           </w:p>
         </w:tc>
@@ -1439,7 +1439,7 @@
           </w:tcPr>
           <w:p>
             <w:r>
-              <w:t>0.822</w:t>
+              <w:t>0.778</w:t>
             </w:r>
           </w:p>
         </w:tc>
@@ -1459,7 +1459,7 @@
           </w:tcPr>
           <w:p>
             <w:r>
-              <w:t>0.600</w:t>
+              <w:t>0.668</w:t>
             </w:r>
           </w:p>
         </w:tc>
@@ -1491,7 +1491,7 @@
           </w:tcPr>
           <w:p>
             <w:r>
-              <w:t>0.613</w:t>
+              <w:t>0.636</w:t>
             </w:r>
           </w:p>
         </w:tc>
@@ -1501,7 +1501,7 @@
           </w:tcPr>
           <w:p>
             <w:r>
-              <w:t>0.602 (FPR 0.5597%)</w:t>
+              <w:t>0.623 (FPR 0.4977%)</w:t>
             </w:r>
           </w:p>
         </w:tc>
@@ -1511,7 +1511,7 @@
           </w:tcPr>
           <w:p>
             <w:r>
-              <w:t>0.981</w:t>
+              <w:t>0.979</w:t>
             </w:r>
           </w:p>
         </w:tc>
@@ -1543,7 +1543,7 @@
           </w:tcPr>
           <w:p>
             <w:r>
-              <w:t>0.031</w:t>
+              <w:t>0.034</w:t>
             </w:r>
           </w:p>
         </w:tc>
@@ -1553,7 +1553,7 @@
           </w:tcPr>
           <w:p>
             <w:r>
-              <w:t>0.018 (FPR 0.4563%)</w:t>
+              <w:t>0.055 (FPR 0.4563%)</w:t>
             </w:r>
           </w:p>
         </w:tc>
@@ -1677,7 +1677,7 @@
     </w:p>
     <w:p>
       <w:r>
-        <w:t>Run artifacts aggregated in this document: 42 run directories under runs/.</w:t>
+        <w:t>Run artifacts aggregated in this document: 100 run directories under runs/.</w:t>
       </w:r>
     </w:p>
     <w:sectPr>

</xml_diff>